<commit_message>
Update resume with NYCM internship and publications, add thesis to research
Co-Authored-By: Claude Opus 4.6 <noreply@anthropic.com>
</commit_message>
<xml_diff>
--- a/assets/Nissen_Joseph_Resume.docx
+++ b/assets/Nissen_Joseph_Resume.docx
@@ -19,7 +19,7 @@
         <w:sectPr>
           <w:footerReference w:type="default" r:id="rId11"/>
           <w:pgSz w:w="12240" w:h="15840"/>
-          <w:pgMar w:top="806" w:right="720" w:bottom="1080" w:left="720" w:header="720" w:footer="720" w:gutter="0"/>
+          <w:pgMar w:top="806" w:right="720" w:bottom="860" w:left="720" w:header="720" w:footer="720" w:gutter="0"/>
           <w:pgBorders w:offsetFrom="page">
             <w:top w:val="inset" w:sz="6" w:space="24" w:color="auto"/>
             <w:left w:val="inset" w:sz="6" w:space="24" w:color="auto"/>
@@ -41,16 +41,7 @@
           <w:sz w:val="36"/>
           <w:szCs w:val="36"/>
         </w:rPr>
-        <w:t>Joseph Nisse</w:t>
-      </w:r>
-      <w:r>
-        <w:rPr>
-          <w:b/>
-          <w:iCs/>
-          <w:sz w:val="36"/>
-          <w:szCs w:val="36"/>
-        </w:rPr>
-        <w:t>n</w:t>
+        <w:t>Joseph Nissen</w:t>
       </w:r>
     </w:p>
     <w:p>
@@ -98,7 +89,6 @@
         <w:t xml:space="preserve"> | (518) 307-8928 | </w:t>
       </w:r>
       <w:hyperlink r:id="rId13">
-        <w:proofErr w:type="spellStart"/>
         <w:r>
           <w:rPr>
             <w:rStyle w:val="Hyperlink"/>
@@ -109,7 +99,6 @@
           </w:rPr>
           <w:t>Linkedin</w:t>
         </w:r>
-        <w:proofErr w:type="spellEnd"/>
       </w:hyperlink>
       <w:bookmarkEnd w:id="0"/>
       <w:bookmarkEnd w:id="3"/>
@@ -130,357 +119,33 @@
     </w:p>
     <w:p>
       <w:pPr>
-        <w:pBdr>
-          <w:bottom w:val="single" w:sz="8" w:space="2" w:color="7F7F7F"/>
-        </w:pBdr>
-        <w:adjustRightInd w:val="0"/>
-        <w:spacing w:after="80" w:line="276" w:lineRule="auto"/>
-        <w:rPr>
-          <w:b/>
-          <w:bCs/>
-          <w:sz w:val="21"/>
-          <w:szCs w:val="21"/>
-        </w:rPr>
-      </w:pPr>
-      <w:bookmarkStart w:id="4" w:name="_Hlk95750319"/>
-      <w:bookmarkStart w:id="5" w:name="_Hlk95750095"/>
-      <w:r>
-        <w:rPr>
-          <w:b/>
-          <w:bCs/>
-          <w:sz w:val="21"/>
-          <w:szCs w:val="21"/>
-        </w:rPr>
-        <w:t>EDUCATION</w:t>
-      </w:r>
-    </w:p>
-    <w:p>
-      <w:pPr>
-        <w:adjustRightInd w:val="0"/>
-        <w:rPr>
-          <w:b/>
-          <w:color w:val="000000"/>
-          <w:sz w:val="21"/>
-          <w:szCs w:val="21"/>
-        </w:rPr>
-      </w:pPr>
-      <w:r>
-        <w:rPr>
-          <w:b/>
-          <w:color w:val="000000"/>
-          <w:sz w:val="21"/>
-          <w:szCs w:val="21"/>
-        </w:rPr>
-        <w:t>Binghamton University, State University of New York, Thomas J. Watson College of Engineering and Applied Science</w:t>
-      </w:r>
-    </w:p>
-    <w:p>
-      <w:pPr>
-        <w:adjustRightInd w:val="0"/>
-        <w:rPr>
-          <w:i/>
-          <w:iCs/>
-          <w:color w:val="000000"/>
-          <w:sz w:val="21"/>
-          <w:szCs w:val="21"/>
-        </w:rPr>
-      </w:pPr>
-      <w:r>
-        <w:rPr>
-          <w:i/>
-          <w:iCs/>
-          <w:color w:val="000000" w:themeColor="text1"/>
-          <w:sz w:val="21"/>
-          <w:szCs w:val="21"/>
-        </w:rPr>
-        <w:t xml:space="preserve">Master of Science in Computer Science with a Focus in Artificial Intelligence                         </w:t>
-      </w:r>
-      <w:r>
-        <w:rPr>
-          <w:i/>
-          <w:iCs/>
-          <w:color w:val="000000" w:themeColor="text1"/>
-          <w:sz w:val="21"/>
-          <w:szCs w:val="21"/>
-        </w:rPr>
-        <w:t xml:space="preserve"> </w:t>
-      </w:r>
-      <w:r>
-        <w:rPr>
-          <w:i/>
-          <w:iCs/>
-          <w:color w:val="000000" w:themeColor="text1"/>
-          <w:sz w:val="21"/>
-          <w:szCs w:val="21"/>
-        </w:rPr>
-        <w:t xml:space="preserve">                       Expected May 2027</w:t>
-      </w:r>
-    </w:p>
-    <w:p>
-      <w:pPr>
-        <w:adjustRightInd w:val="0"/>
-        <w:rPr>
-          <w:bCs/>
-          <w:sz w:val="21"/>
-          <w:szCs w:val="21"/>
-        </w:rPr>
-      </w:pPr>
-      <w:r>
-        <w:rPr>
-          <w:b/>
-          <w:sz w:val="21"/>
-          <w:szCs w:val="21"/>
-        </w:rPr>
-        <w:t xml:space="preserve">Relevant Coursework: </w:t>
-      </w:r>
-      <w:r>
-        <w:rPr>
-          <w:bCs/>
-          <w:sz w:val="21"/>
-          <w:szCs w:val="21"/>
-        </w:rPr>
-        <w:t>Machine Learning, Algorithms, Principles of Programming Languages</w:t>
-      </w:r>
-    </w:p>
-    <w:p>
-      <w:pPr>
-        <w:adjustRightInd w:val="0"/>
-        <w:rPr>
-          <w:b/>
-          <w:bCs/>
-          <w:sz w:val="21"/>
-          <w:szCs w:val="21"/>
-        </w:rPr>
-      </w:pPr>
-    </w:p>
-    <w:p>
-      <w:pPr>
-        <w:adjustRightInd w:val="0"/>
-        <w:rPr>
-          <w:b/>
-          <w:bCs/>
-          <w:sz w:val="21"/>
-          <w:szCs w:val="21"/>
-        </w:rPr>
-      </w:pPr>
-      <w:r>
-        <w:rPr>
-          <w:b/>
-          <w:bCs/>
-          <w:sz w:val="21"/>
-          <w:szCs w:val="21"/>
-        </w:rPr>
-        <w:t>SUNY Polytechnic Institute</w:t>
-      </w:r>
-      <w:r>
-        <w:rPr>
-          <w:sz w:val="21"/>
-          <w:szCs w:val="21"/>
-        </w:rPr>
-        <w:t>, Utica, NY</w:t>
-      </w:r>
-      <w:r>
-        <w:rPr>
-          <w:sz w:val="21"/>
-          <w:szCs w:val="21"/>
-        </w:rPr>
-        <w:tab/>
-      </w:r>
-      <w:r>
-        <w:rPr>
-          <w:sz w:val="21"/>
-          <w:szCs w:val="21"/>
-        </w:rPr>
-        <w:tab/>
-      </w:r>
-      <w:r>
-        <w:rPr>
-          <w:sz w:val="21"/>
-          <w:szCs w:val="21"/>
-        </w:rPr>
-        <w:tab/>
-      </w:r>
-      <w:r>
-        <w:rPr>
-          <w:sz w:val="21"/>
-          <w:szCs w:val="21"/>
-        </w:rPr>
-        <w:tab/>
-      </w:r>
-      <w:r>
-        <w:rPr>
-          <w:sz w:val="21"/>
-          <w:szCs w:val="21"/>
-        </w:rPr>
-        <w:tab/>
-      </w:r>
-      <w:r>
-        <w:rPr>
-          <w:b/>
-          <w:bCs/>
-          <w:sz w:val="21"/>
-          <w:szCs w:val="21"/>
-        </w:rPr>
-        <w:t xml:space="preserve">                            </w:t>
-      </w:r>
-    </w:p>
-    <w:p>
-      <w:pPr>
-        <w:widowControl/>
-        <w:adjustRightInd w:val="0"/>
-        <w:contextualSpacing/>
-        <w:rPr>
-          <w:i/>
-          <w:iCs/>
-          <w:sz w:val="21"/>
-          <w:szCs w:val="21"/>
-        </w:rPr>
-      </w:pPr>
-      <w:r>
-        <w:rPr>
-          <w:i/>
-          <w:iCs/>
-          <w:sz w:val="21"/>
-          <w:szCs w:val="21"/>
-        </w:rPr>
-        <w:t xml:space="preserve">Bachelor of Engineering in Computer Science with a minor in Information Systems                </w:t>
-      </w:r>
-      <w:r>
-        <w:rPr>
-          <w:i/>
-          <w:iCs/>
-          <w:sz w:val="21"/>
-          <w:szCs w:val="21"/>
-        </w:rPr>
-        <w:t xml:space="preserve"> </w:t>
-      </w:r>
-      <w:r>
-        <w:rPr>
-          <w:i/>
-          <w:iCs/>
-          <w:sz w:val="21"/>
-          <w:szCs w:val="21"/>
-        </w:rPr>
-        <w:t xml:space="preserve">                 August 2021-May 2025</w:t>
-      </w:r>
-    </w:p>
-    <w:p>
-      <w:pPr>
-        <w:widowControl/>
-        <w:adjustRightInd w:val="0"/>
-        <w:contextualSpacing/>
-        <w:rPr>
-          <w:sz w:val="21"/>
-          <w:szCs w:val="21"/>
-        </w:rPr>
-      </w:pPr>
-      <w:bookmarkStart w:id="6" w:name="_Hlk95750345"/>
-      <w:bookmarkEnd w:id="4"/>
-      <w:r>
-        <w:rPr>
-          <w:b/>
-          <w:bCs/>
-          <w:sz w:val="21"/>
-          <w:szCs w:val="21"/>
-        </w:rPr>
-        <w:t xml:space="preserve">Cumulative GPA: </w:t>
-      </w:r>
-      <w:r>
-        <w:rPr>
-          <w:sz w:val="21"/>
-          <w:szCs w:val="21"/>
-        </w:rPr>
-        <w:t>3.65</w:t>
-      </w:r>
-    </w:p>
-    <w:p>
-      <w:pPr>
-        <w:widowControl/>
-        <w:adjustRightInd w:val="0"/>
-        <w:contextualSpacing/>
-        <w:rPr>
-          <w:sz w:val="21"/>
-          <w:szCs w:val="21"/>
-        </w:rPr>
-      </w:pPr>
-      <w:r>
-        <w:rPr>
-          <w:b/>
-          <w:bCs/>
-          <w:sz w:val="21"/>
-          <w:szCs w:val="21"/>
-        </w:rPr>
-        <w:t xml:space="preserve">Relevant Coursework: </w:t>
-      </w:r>
-      <w:r>
-        <w:rPr>
-          <w:sz w:val="21"/>
-          <w:szCs w:val="21"/>
-        </w:rPr>
-        <w:t xml:space="preserve">Machine </w:t>
-      </w:r>
-      <w:r>
-        <w:rPr>
-          <w:sz w:val="21"/>
-          <w:szCs w:val="21"/>
-        </w:rPr>
-        <w:t xml:space="preserve">Learning, Artificial Intelligence, LLMs, </w:t>
-      </w:r>
-      <w:r>
-        <w:rPr>
-          <w:sz w:val="21"/>
-          <w:szCs w:val="21"/>
-        </w:rPr>
-        <w:t>Data Structures and Algorithms</w:t>
-      </w:r>
-      <w:r>
-        <w:rPr>
-          <w:sz w:val="21"/>
-          <w:szCs w:val="21"/>
-        </w:rPr>
-        <w:t>, Linear Algebra</w:t>
-      </w:r>
-    </w:p>
-    <w:p>
-      <w:pPr>
-        <w:widowControl/>
-        <w:adjustRightInd w:val="0"/>
-        <w:contextualSpacing/>
-        <w:rPr>
-          <w:sz w:val="21"/>
-          <w:szCs w:val="21"/>
-        </w:rPr>
-      </w:pPr>
-    </w:p>
-    <w:p>
-      <w:pPr>
         <w:pStyle w:val="JobTitle"/>
         <w:pBdr>
           <w:bottom w:val="single" w:sz="8" w:space="1" w:color="7F7F7F"/>
         </w:pBdr>
-        <w:spacing w:after="80"/>
+        <w:spacing w:before="60" w:after="60"/>
         <w:ind w:left="0"/>
-        <w:jc w:val="both"/>
-        <w:rPr>
-          <w:rFonts w:ascii="Times New Roman" w:hAnsi="Times New Roman" w:cs="Times New Roman"/>
-          <w:sz w:val="21"/>
-          <w:szCs w:val="21"/>
-        </w:rPr>
-      </w:pPr>
-      <w:r>
-        <w:rPr>
-          <w:rFonts w:ascii="Times New Roman" w:hAnsi="Times New Roman" w:cs="Times New Roman"/>
-          <w:sz w:val="21"/>
-          <w:szCs w:val="21"/>
-        </w:rPr>
-        <w:t>RELEVANT SKILLS</w:t>
-      </w:r>
-    </w:p>
-    <w:p>
-      <w:pPr>
-        <w:widowControl/>
+        <w:rPr>
+          <w:rFonts w:ascii="Times New Roman" w:hAnsi="Times New Roman" w:cs="Times New Roman"/>
+          <w:sz w:val="21"/>
+          <w:szCs w:val="21"/>
+        </w:rPr>
+      </w:pPr>
+      <w:r>
+        <w:rPr>
+          <w:rFonts w:ascii="Times New Roman" w:hAnsi="Times New Roman" w:cs="Times New Roman"/>
+          <w:sz w:val="21"/>
+          <w:szCs w:val="21"/>
+        </w:rPr>
+        <w:t xml:space="preserve">EDUCATION</w:t>
+      </w:r>
+    </w:p>
+    <w:p>
+      <w:pPr>
+        <w:tabs>
+          <w:tab w:val="right" w:pos="10790"/>
+        </w:tabs>
         <w:adjustRightInd w:val="0"/>
-        <w:contextualSpacing/>
         <w:rPr>
           <w:sz w:val="21"/>
           <w:szCs w:val="21"/>
@@ -493,49 +158,56 @@
           <w:sz w:val="21"/>
           <w:szCs w:val="21"/>
         </w:rPr>
-        <w:t xml:space="preserve">Languages: </w:t>
-      </w:r>
-      <w:r>
-        <w:rPr>
-          <w:sz w:val="21"/>
-          <w:szCs w:val="21"/>
-        </w:rPr>
-        <w:t>C, C++, Java, Python</w:t>
-      </w:r>
-      <w:r>
-        <w:rPr>
-          <w:sz w:val="21"/>
-          <w:szCs w:val="21"/>
-        </w:rPr>
-        <w:t xml:space="preserve">, </w:t>
-      </w:r>
-      <w:r>
-        <w:rPr>
-          <w:sz w:val="21"/>
-          <w:szCs w:val="21"/>
-        </w:rPr>
-        <w:t>Prolog</w:t>
-      </w:r>
-      <w:r>
-        <w:rPr>
-          <w:sz w:val="21"/>
-          <w:szCs w:val="21"/>
-        </w:rPr>
-        <w:t>, Fortran</w:t>
-      </w:r>
-      <w:r>
-        <w:rPr>
-          <w:sz w:val="21"/>
-          <w:szCs w:val="21"/>
-        </w:rPr>
-        <w:t>, Haskell</w:t>
-      </w:r>
-    </w:p>
-    <w:p>
-      <w:pPr>
-        <w:widowControl/>
+        <w:t xml:space="preserve">Binghamton University, State University of New York, Thomas J. Watson College of Engineering and Applied Science</w:t>
+      </w:r>
+    </w:p>
+    <w:p>
+      <w:pPr>
+        <w:tabs>
+          <w:tab w:val="right" w:pos="10790"/>
+        </w:tabs>
         <w:adjustRightInd w:val="0"/>
-        <w:contextualSpacing/>
+        <w:rPr>
+          <w:sz w:val="21"/>
+          <w:szCs w:val="21"/>
+        </w:rPr>
+      </w:pPr>
+      <w:r>
+        <w:rPr>
+          <w:i/>
+          <w:iCs/>
+          <w:sz w:val="21"/>
+          <w:szCs w:val="21"/>
+        </w:rPr>
+        <w:t xml:space="preserve">Master of Science in Computer Science with a Focus in Artificial Intelligence</w:t>
+      </w:r>
+      <w:r>
+        <w:rPr>
+          <w:i/>
+          <w:iCs/>
+          <w:sz w:val="21"/>
+          <w:szCs w:val="21"/>
+        </w:rPr>
+        <w:t xml:space="preserve"/>
+        <w:tab/>
+        <w:t xml:space="preserve"/>
+      </w:r>
+      <w:r>
+        <w:rPr>
+          <w:i/>
+          <w:iCs/>
+          <w:sz w:val="21"/>
+          <w:szCs w:val="21"/>
+        </w:rPr>
+        <w:t xml:space="preserve">Expected May 2027</w:t>
+      </w:r>
+    </w:p>
+    <w:p>
+      <w:pPr>
+        <w:tabs>
+          <w:tab w:val="right" w:pos="10790"/>
+        </w:tabs>
+        <w:adjustRightInd w:val="0"/>
         <w:rPr>
           <w:sz w:val="21"/>
           <w:szCs w:val="21"/>
@@ -548,8 +220,27 @@
           <w:sz w:val="21"/>
           <w:szCs w:val="21"/>
         </w:rPr>
-        <w:t>Software</w:t>
-      </w:r>
+        <w:t xml:space="preserve">Cumulative GPA: </w:t>
+      </w:r>
+      <w:r>
+        <w:rPr>
+          <w:sz w:val="21"/>
+          <w:szCs w:val="21"/>
+        </w:rPr>
+        <w:t xml:space="preserve">3.85</w:t>
+      </w:r>
+    </w:p>
+    <w:p>
+      <w:pPr>
+        <w:tabs>
+          <w:tab w:val="right" w:pos="10790"/>
+        </w:tabs>
+        <w:adjustRightInd w:val="0"/>
+        <w:rPr>
+          <w:sz w:val="21"/>
+          <w:szCs w:val="21"/>
+        </w:rPr>
+      </w:pPr>
       <w:r>
         <w:rPr>
           <w:b/>
@@ -557,70 +248,31 @@
           <w:sz w:val="21"/>
           <w:szCs w:val="21"/>
         </w:rPr>
-        <w:t xml:space="preserve">: </w:t>
-      </w:r>
-      <w:r>
-        <w:rPr>
-          <w:sz w:val="21"/>
-          <w:szCs w:val="21"/>
-        </w:rPr>
-        <w:t>Visual Studio</w:t>
-      </w:r>
-      <w:r>
-        <w:rPr>
-          <w:sz w:val="21"/>
-          <w:szCs w:val="21"/>
-        </w:rPr>
-        <w:t>/</w:t>
-      </w:r>
-      <w:r>
-        <w:rPr>
-          <w:sz w:val="21"/>
-          <w:szCs w:val="21"/>
-        </w:rPr>
-        <w:t>Visual Studio</w:t>
-      </w:r>
-      <w:r>
-        <w:rPr>
-          <w:sz w:val="21"/>
-          <w:szCs w:val="21"/>
-        </w:rPr>
-        <w:t xml:space="preserve"> Code, Git</w:t>
-      </w:r>
-      <w:r>
-        <w:rPr>
-          <w:sz w:val="21"/>
-          <w:szCs w:val="21"/>
-        </w:rPr>
-        <w:t>,</w:t>
-      </w:r>
-      <w:r>
-        <w:rPr>
-          <w:sz w:val="21"/>
-          <w:szCs w:val="21"/>
-        </w:rPr>
-        <w:t xml:space="preserve"> </w:t>
-      </w:r>
-      <w:r>
-        <w:rPr>
-          <w:sz w:val="21"/>
-          <w:szCs w:val="21"/>
-        </w:rPr>
-        <w:t>Jupyter Notebooks</w:t>
-      </w:r>
-      <w:r>
-        <w:rPr>
-          <w:sz w:val="21"/>
-          <w:szCs w:val="21"/>
-        </w:rPr>
-        <w:t>, Google Colab</w:t>
-      </w:r>
-    </w:p>
-    <w:p>
-      <w:pPr>
-        <w:widowControl/>
+        <w:t xml:space="preserve">Relevant Coursework: </w:t>
+      </w:r>
+      <w:r>
+        <w:rPr>
+          <w:sz w:val="21"/>
+          <w:szCs w:val="21"/>
+        </w:rPr>
+        <w:t xml:space="preserve">Algorithms, Principles of Programming Languages, Machine Learning</w:t>
+      </w:r>
+    </w:p>
+    <w:p>
+      <w:pPr>
         <w:adjustRightInd w:val="0"/>
-        <w:contextualSpacing/>
+        <w:rPr>
+          <w:sz w:val="21"/>
+          <w:szCs w:val="21"/>
+        </w:rPr>
+      </w:pPr>
+    </w:p>
+    <w:p>
+      <w:pPr>
+        <w:tabs>
+          <w:tab w:val="right" w:pos="10790"/>
+        </w:tabs>
+        <w:adjustRightInd w:val="0"/>
         <w:rPr>
           <w:sz w:val="21"/>
           <w:szCs w:val="21"/>
@@ -633,61 +285,112 @@
           <w:sz w:val="21"/>
           <w:szCs w:val="21"/>
         </w:rPr>
-        <w:t xml:space="preserve">Additional: </w:t>
-      </w:r>
-      <w:r>
-        <w:rPr>
-          <w:sz w:val="21"/>
-          <w:szCs w:val="21"/>
-        </w:rPr>
-        <w:t>PostgreSQL</w:t>
-      </w:r>
-      <w:r>
-        <w:rPr>
-          <w:sz w:val="21"/>
-          <w:szCs w:val="21"/>
-        </w:rPr>
-        <w:t xml:space="preserve">, </w:t>
-      </w:r>
-      <w:r>
-        <w:rPr>
-          <w:sz w:val="21"/>
-          <w:szCs w:val="21"/>
-        </w:rPr>
-        <w:t xml:space="preserve">Mongoose, </w:t>
-      </w:r>
-      <w:r>
-        <w:rPr>
-          <w:sz w:val="21"/>
-          <w:szCs w:val="21"/>
-        </w:rPr>
-        <w:t xml:space="preserve">Data Preprocessing, </w:t>
-      </w:r>
-      <w:r>
-        <w:rPr>
-          <w:sz w:val="21"/>
-          <w:szCs w:val="21"/>
-        </w:rPr>
-        <w:t>Data Visualization, Data Ana</w:t>
-      </w:r>
-      <w:r>
-        <w:rPr>
-          <w:sz w:val="21"/>
-          <w:szCs w:val="21"/>
-        </w:rPr>
-        <w:t>lytics</w:t>
-      </w:r>
-    </w:p>
-    <w:p>
-      <w:pPr>
-        <w:widowControl/>
+        <w:t xml:space="preserve">SUNY Polytechnic Institute</w:t>
+      </w:r>
+      <w:r>
+        <w:rPr>
+          <w:sz w:val="21"/>
+          <w:szCs w:val="21"/>
+        </w:rPr>
+        <w:t xml:space="preserve">, Utica, NY</w:t>
+      </w:r>
+    </w:p>
+    <w:p>
+      <w:pPr>
+        <w:tabs>
+          <w:tab w:val="right" w:pos="10790"/>
+        </w:tabs>
         <w:adjustRightInd w:val="0"/>
-        <w:contextualSpacing/>
-        <w:rPr>
-          <w:sz w:val="21"/>
-          <w:szCs w:val="21"/>
-        </w:rPr>
-      </w:pPr>
+        <w:rPr>
+          <w:sz w:val="21"/>
+          <w:szCs w:val="21"/>
+        </w:rPr>
+      </w:pPr>
+      <w:r>
+        <w:rPr>
+          <w:i/>
+          <w:iCs/>
+          <w:sz w:val="21"/>
+          <w:szCs w:val="21"/>
+        </w:rPr>
+        <w:t xml:space="preserve">Bachelor of Engineering in Computer Science with a minor in Information Systems</w:t>
+      </w:r>
+      <w:r>
+        <w:rPr>
+          <w:i/>
+          <w:iCs/>
+          <w:sz w:val="21"/>
+          <w:szCs w:val="21"/>
+        </w:rPr>
+        <w:t xml:space="preserve"/>
+        <w:tab/>
+        <w:t xml:space="preserve"/>
+      </w:r>
+      <w:r>
+        <w:rPr>
+          <w:i/>
+          <w:iCs/>
+          <w:sz w:val="21"/>
+          <w:szCs w:val="21"/>
+        </w:rPr>
+        <w:t xml:space="preserve">August 2021 - May 2025</w:t>
+      </w:r>
+    </w:p>
+    <w:p>
+      <w:pPr>
+        <w:tabs>
+          <w:tab w:val="right" w:pos="10790"/>
+        </w:tabs>
+        <w:adjustRightInd w:val="0"/>
+        <w:rPr>
+          <w:sz w:val="21"/>
+          <w:szCs w:val="21"/>
+        </w:rPr>
+      </w:pPr>
+      <w:r>
+        <w:rPr>
+          <w:b/>
+          <w:bCs/>
+          <w:sz w:val="21"/>
+          <w:szCs w:val="21"/>
+        </w:rPr>
+        <w:t xml:space="preserve">Cumulative GPA: </w:t>
+      </w:r>
+      <w:r>
+        <w:rPr>
+          <w:sz w:val="21"/>
+          <w:szCs w:val="21"/>
+        </w:rPr>
+        <w:t xml:space="preserve">3.65</w:t>
+      </w:r>
+    </w:p>
+    <w:p>
+      <w:pPr>
+        <w:tabs>
+          <w:tab w:val="right" w:pos="10790"/>
+        </w:tabs>
+        <w:adjustRightInd w:val="0"/>
+        <w:rPr>
+          <w:sz w:val="21"/>
+          <w:szCs w:val="21"/>
+        </w:rPr>
+      </w:pPr>
+      <w:r>
+        <w:rPr>
+          <w:b/>
+          <w:bCs/>
+          <w:sz w:val="21"/>
+          <w:szCs w:val="21"/>
+        </w:rPr>
+        <w:t xml:space="preserve">Relevant Coursework: </w:t>
+      </w:r>
+      <w:r>
+        <w:rPr>
+          <w:sz w:val="21"/>
+          <w:szCs w:val="21"/>
+        </w:rPr>
+        <w:t xml:space="preserve">Artificial Intelligence, LLMs, Data Structures and Algorithms, Linear Algebra</w:t>
+      </w:r>
     </w:p>
     <w:p>
       <w:pPr>
@@ -695,71 +398,48 @@
         <w:pBdr>
           <w:bottom w:val="single" w:sz="8" w:space="1" w:color="7F7F7F"/>
         </w:pBdr>
-        <w:spacing w:after="80"/>
+        <w:spacing w:before="60" w:after="60"/>
         <w:ind w:left="0"/>
-        <w:jc w:val="both"/>
-        <w:rPr>
-          <w:rFonts w:ascii="Times New Roman" w:hAnsi="Times New Roman" w:cs="Times New Roman"/>
-          <w:sz w:val="21"/>
-          <w:szCs w:val="21"/>
-        </w:rPr>
-      </w:pPr>
-      <w:r>
-        <w:rPr>
-          <w:rFonts w:ascii="Times New Roman" w:hAnsi="Times New Roman" w:cs="Times New Roman"/>
-          <w:sz w:val="21"/>
-          <w:szCs w:val="21"/>
-        </w:rPr>
-        <w:t>PROFESSIONAL EXPERIENCE</w:t>
+        <w:rPr>
+          <w:rFonts w:ascii="Times New Roman" w:hAnsi="Times New Roman" w:cs="Times New Roman"/>
+          <w:sz w:val="21"/>
+          <w:szCs w:val="21"/>
+        </w:rPr>
+      </w:pPr>
+      <w:r>
+        <w:rPr>
+          <w:rFonts w:ascii="Times New Roman" w:hAnsi="Times New Roman" w:cs="Times New Roman"/>
+          <w:sz w:val="21"/>
+          <w:szCs w:val="21"/>
+        </w:rPr>
+        <w:t xml:space="preserve">PROFESSIONAL EXPERIENCE</w:t>
       </w:r>
     </w:p>
     <w:p>
       <w:pPr>
         <w:pStyle w:val="JobTitle"/>
+        <w:tabs>
+          <w:tab w:val="clear" w:pos="7560"/>
+          <w:tab w:val="right" w:pos="10790"/>
+        </w:tabs>
         <w:ind w:left="0"/>
         <w:rPr>
-          <w:b w:val="0"/>
-          <w:sz w:val="21"/>
-          <w:szCs w:val="21"/>
-        </w:rPr>
-      </w:pPr>
-      <w:r>
-        <w:rPr>
-          <w:sz w:val="21"/>
-          <w:szCs w:val="21"/>
-        </w:rPr>
-        <w:t>SUNY Polytechnic Institute</w:t>
-      </w:r>
-      <w:r>
-        <w:rPr>
-          <w:sz w:val="21"/>
-          <w:szCs w:val="21"/>
-        </w:rPr>
-        <w:t xml:space="preserve"> - Artificial</w:t>
-      </w:r>
-      <w:r>
-        <w:rPr>
-          <w:sz w:val="21"/>
-          <w:szCs w:val="21"/>
-        </w:rPr>
-        <w:t xml:space="preserve"> Intelligence Exploration (AIX) Research Assistant                                   </w:t>
-      </w:r>
-      <w:r>
-        <w:rPr>
-          <w:sz w:val="21"/>
-          <w:szCs w:val="21"/>
-        </w:rPr>
-        <w:t xml:space="preserve"> </w:t>
-      </w:r>
-      <w:r>
-        <w:rPr>
-          <w:sz w:val="21"/>
-          <w:szCs w:val="21"/>
-        </w:rPr>
-        <w:t xml:space="preserve">               </w:t>
-      </w:r>
-      <w:r>
-        <w:rPr>
+          <w:rFonts w:ascii="Times New Roman" w:hAnsi="Times New Roman" w:cs="Times New Roman"/>
+          <w:sz w:val="21"/>
+          <w:szCs w:val="21"/>
+        </w:rPr>
+      </w:pPr>
+      <w:r>
+        <w:rPr>
+          <w:rFonts w:ascii="Times New Roman" w:hAnsi="Times New Roman" w:cs="Times New Roman"/>
+          <w:sz w:val="21"/>
+          <w:szCs w:val="21"/>
+        </w:rPr>
+        <w:t xml:space="preserve">NYCM Insurance - Advanced Business Analytics Intern</w:t>
+      </w:r>
+      <w:r>
+        <w:rPr>
+          <w:rFonts w:ascii="Times New Roman" w:hAnsi="Times New Roman" w:cs="Times New Roman"/>
           <w:b w:val="0"/>
           <w:bCs/>
           <w:i/>
@@ -767,7 +447,8 @@
           <w:sz w:val="21"/>
           <w:szCs w:val="21"/>
         </w:rPr>
-        <w:t>2024-2025</w:t>
+        <w:tab/>
+        <w:t>May 2026 - August 2026</w:t>
       </w:r>
     </w:p>
     <w:p>
@@ -777,35 +458,26 @@
           <w:ilvl w:val="0"/>
           <w:numId w:val="8"/>
         </w:numPr>
-        <w:rPr>
-          <w:b w:val="0"/>
-          <w:sz w:val="21"/>
-          <w:szCs w:val="21"/>
-        </w:rPr>
-      </w:pPr>
-      <w:r>
-        <w:rPr>
-          <w:b w:val="0"/>
-          <w:sz w:val="21"/>
-          <w:szCs w:val="21"/>
-        </w:rPr>
-        <w:t xml:space="preserve">Expanding on the personal knowledge management tool from previous research position to accommodate for </w:t>
-      </w:r>
-      <w:r>
-        <w:rPr>
-          <w:b w:val="0"/>
-          <w:sz w:val="21"/>
-          <w:szCs w:val="21"/>
-        </w:rPr>
-        <w:t>many</w:t>
-      </w:r>
-      <w:r>
-        <w:rPr>
-          <w:b w:val="0"/>
-          <w:sz w:val="21"/>
-          <w:szCs w:val="21"/>
-        </w:rPr>
-        <w:t xml:space="preserve"> users by utilizing MERN full stack development</w:t>
+        <w:tabs>
+          <w:tab w:val="clear" w:pos="7560"/>
+        </w:tabs>
+        <w:rPr>
+          <w:rFonts w:ascii="Times New Roman" w:hAnsi="Times New Roman" w:cs="Times New Roman"/>
+          <w:b w:val="0"/>
+          <w:bCs/>
+          <w:sz w:val="21"/>
+          <w:szCs w:val="21"/>
+        </w:rPr>
+      </w:pPr>
+      <w:r>
+        <w:rPr>
+          <w:rFonts w:ascii="Times New Roman" w:hAnsi="Times New Roman" w:cs="Times New Roman"/>
+          <w:b w:val="0"/>
+          <w:bCs/>
+          <w:sz w:val="21"/>
+          <w:szCs w:val="21"/>
+        </w:rPr>
+        <w:t xml:space="preserve">Automated data extraction from third-party sources using Python and pandas</w:t>
       </w:r>
     </w:p>
     <w:p>
@@ -815,115 +487,111 @@
           <w:ilvl w:val="0"/>
           <w:numId w:val="8"/>
         </w:numPr>
-        <w:rPr>
-          <w:b w:val="0"/>
-          <w:sz w:val="21"/>
-          <w:szCs w:val="21"/>
-        </w:rPr>
-      </w:pPr>
-      <w:r>
-        <w:rPr>
-          <w:b w:val="0"/>
-          <w:sz w:val="21"/>
-          <w:szCs w:val="21"/>
-        </w:rPr>
-        <w:t xml:space="preserve">Working on a step-by-step guide that will be utilized within a </w:t>
-      </w:r>
-      <w:r>
-        <w:rPr>
-          <w:b w:val="0"/>
-          <w:sz w:val="21"/>
-          <w:szCs w:val="21"/>
-        </w:rPr>
-        <w:t>master’s</w:t>
-      </w:r>
-      <w:r>
-        <w:rPr>
-          <w:b w:val="0"/>
-          <w:sz w:val="21"/>
-          <w:szCs w:val="21"/>
-        </w:rPr>
-        <w:t xml:space="preserve"> course at SUNY Poly that will teach the students how to use TiddlyWiki, an open-source dynamic notebook</w:t>
+        <w:tabs>
+          <w:tab w:val="clear" w:pos="7560"/>
+        </w:tabs>
+        <w:rPr>
+          <w:rFonts w:ascii="Times New Roman" w:hAnsi="Times New Roman" w:cs="Times New Roman"/>
+          <w:b w:val="0"/>
+          <w:bCs/>
+          <w:sz w:val="21"/>
+          <w:szCs w:val="21"/>
+        </w:rPr>
+      </w:pPr>
+      <w:r>
+        <w:rPr>
+          <w:rFonts w:ascii="Times New Roman" w:hAnsi="Times New Roman" w:cs="Times New Roman"/>
+          <w:b w:val="0"/>
+          <w:bCs/>
+          <w:sz w:val="21"/>
+          <w:szCs w:val="21"/>
+        </w:rPr>
+        <w:t xml:space="preserve">Curated and cleaned the resulting datasets for downstream analysis and modeling</w:t>
       </w:r>
     </w:p>
     <w:p>
       <w:pPr>
         <w:pStyle w:val="JobTitle"/>
+        <w:numPr>
+          <w:ilvl w:val="0"/>
+          <w:numId w:val="8"/>
+        </w:numPr>
+        <w:tabs>
+          <w:tab w:val="clear" w:pos="7560"/>
+        </w:tabs>
+        <w:rPr>
+          <w:rFonts w:ascii="Times New Roman" w:hAnsi="Times New Roman" w:cs="Times New Roman"/>
+          <w:b w:val="0"/>
+          <w:bCs/>
+          <w:sz w:val="21"/>
+          <w:szCs w:val="21"/>
+        </w:rPr>
+      </w:pPr>
+      <w:r>
+        <w:rPr>
+          <w:rFonts w:ascii="Times New Roman" w:hAnsi="Times New Roman" w:cs="Times New Roman"/>
+          <w:b w:val="0"/>
+          <w:bCs/>
+          <w:sz w:val="21"/>
+          <w:szCs w:val="21"/>
+        </w:rPr>
+        <w:t xml:space="preserve">Built models to support underwriter decision-making</w:t>
+      </w:r>
+    </w:p>
+    <w:p>
+      <w:pPr>
+        <w:pStyle w:val="JobTitle"/>
+        <w:numPr>
+          <w:ilvl w:val="0"/>
+          <w:numId w:val="8"/>
+        </w:numPr>
+        <w:tabs>
+          <w:tab w:val="clear" w:pos="7560"/>
+        </w:tabs>
+        <w:rPr>
+          <w:rFonts w:ascii="Times New Roman" w:hAnsi="Times New Roman" w:cs="Times New Roman"/>
+          <w:b w:val="0"/>
+          <w:bCs/>
+          <w:sz w:val="21"/>
+          <w:szCs w:val="21"/>
+        </w:rPr>
+      </w:pPr>
+      <w:r>
+        <w:rPr>
+          <w:rFonts w:ascii="Times New Roman" w:hAnsi="Times New Roman" w:cs="Times New Roman"/>
+          <w:b w:val="0"/>
+          <w:bCs/>
+          <w:sz w:val="21"/>
+          <w:szCs w:val="21"/>
+        </w:rPr>
+        <w:t xml:space="preserve">Delivered finished results through a Tableau dashboard for underwriting teams</w:t>
+      </w:r>
+    </w:p>
+    <w:p>
+      <w:pPr>
+        <w:pStyle w:val="JobTitle"/>
+        <w:tabs>
+          <w:tab w:val="clear" w:pos="7560"/>
+          <w:tab w:val="right" w:pos="10790"/>
+        </w:tabs>
         <w:ind w:left="0"/>
         <w:rPr>
-          <w:sz w:val="21"/>
-          <w:szCs w:val="21"/>
-        </w:rPr>
-      </w:pPr>
-      <w:r>
-        <w:rPr>
-          <w:sz w:val="21"/>
-          <w:szCs w:val="21"/>
-        </w:rPr>
-        <w:t>Undergr</w:t>
-      </w:r>
-      <w:r>
-        <w:rPr>
-          <w:sz w:val="21"/>
-          <w:szCs w:val="21"/>
-        </w:rPr>
-        <w:t>aduate Researcher – Student Undergraduate Research Program (</w:t>
-      </w:r>
-      <w:proofErr w:type="gramStart"/>
-      <w:r>
-        <w:rPr>
-          <w:sz w:val="21"/>
-          <w:szCs w:val="21"/>
-        </w:rPr>
-        <w:t>SURP)</w:t>
-      </w:r>
-      <w:r>
-        <w:rPr>
-          <w:sz w:val="21"/>
-          <w:szCs w:val="21"/>
-        </w:rPr>
-        <w:t xml:space="preserve">   </w:t>
-      </w:r>
-      <w:proofErr w:type="gramEnd"/>
-      <w:r>
-        <w:rPr>
-          <w:sz w:val="21"/>
-          <w:szCs w:val="21"/>
-        </w:rPr>
-        <w:t xml:space="preserve">    </w:t>
-      </w:r>
-      <w:r>
-        <w:tab/>
-      </w:r>
-      <w:r>
-        <w:tab/>
-      </w:r>
-      <w:r>
-        <w:tab/>
-      </w:r>
-      <w:r>
-        <w:rPr>
-          <w:sz w:val="21"/>
-          <w:szCs w:val="21"/>
-        </w:rPr>
-        <w:t xml:space="preserve">                              </w:t>
-      </w:r>
-      <w:r>
-        <w:rPr>
-          <w:sz w:val="21"/>
-          <w:szCs w:val="21"/>
-        </w:rPr>
-        <w:t xml:space="preserve">     </w:t>
-      </w:r>
-      <w:r>
-        <w:rPr>
-          <w:sz w:val="21"/>
-          <w:szCs w:val="21"/>
-        </w:rPr>
-        <w:t xml:space="preserve"> </w:t>
-      </w:r>
-      <w:r>
-        <w:rPr>
+          <w:rFonts w:ascii="Times New Roman" w:hAnsi="Times New Roman" w:cs="Times New Roman"/>
+          <w:sz w:val="21"/>
+          <w:szCs w:val="21"/>
+        </w:rPr>
+      </w:pPr>
+      <w:r>
+        <w:rPr>
+          <w:rFonts w:ascii="Times New Roman" w:hAnsi="Times New Roman" w:cs="Times New Roman"/>
+          <w:sz w:val="21"/>
+          <w:szCs w:val="21"/>
+        </w:rPr>
+        <w:t xml:space="preserve">SUNY Polytechnic Institute - Undergraduate Researcher, AI Exploration (AIX) and SURP</w:t>
+      </w:r>
+      <w:r>
+        <w:rPr>
+          <w:rFonts w:ascii="Times New Roman" w:hAnsi="Times New Roman" w:cs="Times New Roman"/>
           <w:b w:val="0"/>
           <w:bCs/>
           <w:i/>
@@ -931,7 +599,8 @@
           <w:sz w:val="21"/>
           <w:szCs w:val="21"/>
         </w:rPr>
-        <w:t>2024</w:t>
+        <w:tab/>
+        <w:t>2024 - 2025</w:t>
       </w:r>
     </w:p>
     <w:p>
@@ -941,19 +610,26 @@
           <w:ilvl w:val="0"/>
           <w:numId w:val="7"/>
         </w:numPr>
-        <w:rPr>
-          <w:b w:val="0"/>
-          <w:sz w:val="21"/>
-          <w:szCs w:val="21"/>
-        </w:rPr>
-      </w:pPr>
-      <w:r>
-        <w:rPr>
-          <w:b w:val="0"/>
-          <w:sz w:val="21"/>
-          <w:szCs w:val="21"/>
-        </w:rPr>
-        <w:t>Created a personal knowledge management system for the collection and analysis of AI chatbot conversations while contributing to an open-source wiki</w:t>
+        <w:tabs>
+          <w:tab w:val="clear" w:pos="7560"/>
+        </w:tabs>
+        <w:rPr>
+          <w:rFonts w:ascii="Times New Roman" w:hAnsi="Times New Roman" w:cs="Times New Roman"/>
+          <w:b w:val="0"/>
+          <w:bCs/>
+          <w:sz w:val="21"/>
+          <w:szCs w:val="21"/>
+        </w:rPr>
+      </w:pPr>
+      <w:r>
+        <w:rPr>
+          <w:rFonts w:ascii="Times New Roman" w:hAnsi="Times New Roman" w:cs="Times New Roman"/>
+          <w:b w:val="0"/>
+          <w:bCs/>
+          <w:sz w:val="21"/>
+          <w:szCs w:val="21"/>
+        </w:rPr>
+        <w:t xml:space="preserve">Built a personal knowledge management system for analyzing AI chatbot conversations on an open-source wiki</w:t>
       </w:r>
     </w:p>
     <w:p>
@@ -963,35 +639,26 @@
           <w:ilvl w:val="0"/>
           <w:numId w:val="7"/>
         </w:numPr>
-        <w:rPr>
-          <w:b w:val="0"/>
-          <w:sz w:val="21"/>
-          <w:szCs w:val="21"/>
-        </w:rPr>
-      </w:pPr>
-      <w:r>
-        <w:rPr>
-          <w:b w:val="0"/>
-          <w:sz w:val="21"/>
-          <w:szCs w:val="21"/>
-        </w:rPr>
-        <w:t xml:space="preserve">Managed two-week Agile sprints; led code reviews and system testing across a </w:t>
-      </w:r>
-      <w:r>
-        <w:rPr>
-          <w:b w:val="0"/>
-          <w:sz w:val="21"/>
-          <w:szCs w:val="21"/>
-        </w:rPr>
-        <w:t>3</w:t>
-      </w:r>
-      <w:r>
-        <w:rPr>
-          <w:b w:val="0"/>
-          <w:sz w:val="21"/>
-          <w:szCs w:val="21"/>
-        </w:rPr>
-        <w:t>-person research team</w:t>
+        <w:tabs>
+          <w:tab w:val="clear" w:pos="7560"/>
+        </w:tabs>
+        <w:rPr>
+          <w:rFonts w:ascii="Times New Roman" w:hAnsi="Times New Roman" w:cs="Times New Roman"/>
+          <w:b w:val="0"/>
+          <w:bCs/>
+          <w:sz w:val="21"/>
+          <w:szCs w:val="21"/>
+        </w:rPr>
+      </w:pPr>
+      <w:r>
+        <w:rPr>
+          <w:rFonts w:ascii="Times New Roman" w:hAnsi="Times New Roman" w:cs="Times New Roman"/>
+          <w:b w:val="0"/>
+          <w:bCs/>
+          <w:sz w:val="21"/>
+          <w:szCs w:val="21"/>
+        </w:rPr>
+        <w:t xml:space="preserve">Extended the tool to support multiple concurrent users using MERN full stack development</w:t>
       </w:r>
     </w:p>
     <w:p>
@@ -1001,48 +668,56 @@
           <w:ilvl w:val="0"/>
           <w:numId w:val="7"/>
         </w:numPr>
-        <w:rPr>
-          <w:b w:val="0"/>
-          <w:sz w:val="21"/>
-          <w:szCs w:val="21"/>
-        </w:rPr>
-      </w:pPr>
-      <w:r>
-        <w:rPr>
-          <w:b w:val="0"/>
-          <w:sz w:val="21"/>
-          <w:szCs w:val="21"/>
-        </w:rPr>
-        <w:t>Presented progress</w:t>
-      </w:r>
-      <w:r>
-        <w:rPr>
-          <w:b w:val="0"/>
-          <w:sz w:val="21"/>
-          <w:szCs w:val="21"/>
-        </w:rPr>
-        <w:t xml:space="preserve"> in the form of a poster </w:t>
-      </w:r>
-      <w:r>
-        <w:rPr>
-          <w:b w:val="0"/>
-          <w:sz w:val="21"/>
-          <w:szCs w:val="21"/>
-        </w:rPr>
-        <w:t>presentation</w:t>
-      </w:r>
-    </w:p>
-    <w:p>
-      <w:pPr>
-        <w:widowControl/>
-        <w:adjustRightInd w:val="0"/>
-        <w:contextualSpacing/>
-        <w:rPr>
-          <w:b/>
-          <w:sz w:val="21"/>
-          <w:szCs w:val="21"/>
-        </w:rPr>
-      </w:pPr>
+        <w:tabs>
+          <w:tab w:val="clear" w:pos="7560"/>
+        </w:tabs>
+        <w:rPr>
+          <w:rFonts w:ascii="Times New Roman" w:hAnsi="Times New Roman" w:cs="Times New Roman"/>
+          <w:b w:val="0"/>
+          <w:bCs/>
+          <w:sz w:val="21"/>
+          <w:szCs w:val="21"/>
+        </w:rPr>
+      </w:pPr>
+      <w:r>
+        <w:rPr>
+          <w:rFonts w:ascii="Times New Roman" w:hAnsi="Times New Roman" w:cs="Times New Roman"/>
+          <w:b w:val="0"/>
+          <w:bCs/>
+          <w:sz w:val="21"/>
+          <w:szCs w:val="21"/>
+        </w:rPr>
+        <w:t xml:space="preserve">Managed two-week Agile sprints; led code reviews and system testing across a 3-person research team</w:t>
+      </w:r>
+    </w:p>
+    <w:p>
+      <w:pPr>
+        <w:pStyle w:val="JobTitle"/>
+        <w:numPr>
+          <w:ilvl w:val="0"/>
+          <w:numId w:val="7"/>
+        </w:numPr>
+        <w:tabs>
+          <w:tab w:val="clear" w:pos="7560"/>
+        </w:tabs>
+        <w:rPr>
+          <w:rFonts w:ascii="Times New Roman" w:hAnsi="Times New Roman" w:cs="Times New Roman"/>
+          <w:b w:val="0"/>
+          <w:bCs/>
+          <w:sz w:val="21"/>
+          <w:szCs w:val="21"/>
+        </w:rPr>
+      </w:pPr>
+      <w:r>
+        <w:rPr>
+          <w:rFonts w:ascii="Times New Roman" w:hAnsi="Times New Roman" w:cs="Times New Roman"/>
+          <w:b w:val="0"/>
+          <w:bCs/>
+          <w:sz w:val="21"/>
+          <w:szCs w:val="21"/>
+        </w:rPr>
+        <w:t xml:space="preserve">Authored a TiddlyWiki guide adopted in a SUNY Poly master’s course; presented results in a poster session</w:t>
+      </w:r>
     </w:p>
     <w:p>
       <w:pPr>
@@ -1050,90 +725,176 @@
         <w:pBdr>
           <w:bottom w:val="single" w:sz="8" w:space="1" w:color="7F7F7F"/>
         </w:pBdr>
-        <w:spacing w:after="80"/>
+        <w:spacing w:before="60" w:after="60"/>
         <w:ind w:left="0"/>
-        <w:jc w:val="both"/>
-        <w:rPr>
-          <w:rFonts w:ascii="Times New Roman" w:hAnsi="Times New Roman" w:cs="Times New Roman"/>
-          <w:sz w:val="21"/>
-          <w:szCs w:val="21"/>
-        </w:rPr>
-      </w:pPr>
-      <w:bookmarkStart w:id="7" w:name="_Hlk95750489"/>
-      <w:bookmarkStart w:id="8" w:name="_Hlk129801036"/>
-      <w:bookmarkEnd w:id="6"/>
-      <w:r>
-        <w:rPr>
-          <w:rFonts w:ascii="Times New Roman" w:hAnsi="Times New Roman" w:cs="Times New Roman"/>
-          <w:sz w:val="21"/>
-          <w:szCs w:val="21"/>
-        </w:rPr>
-        <w:t>P</w:t>
-      </w:r>
-      <w:r>
-        <w:rPr>
-          <w:rFonts w:ascii="Times New Roman" w:hAnsi="Times New Roman" w:cs="Times New Roman"/>
-          <w:sz w:val="21"/>
-          <w:szCs w:val="21"/>
-        </w:rPr>
-        <w:t>RO</w:t>
-      </w:r>
-      <w:r>
-        <w:rPr>
-          <w:rFonts w:ascii="Times New Roman" w:hAnsi="Times New Roman" w:cs="Times New Roman"/>
-          <w:sz w:val="21"/>
-          <w:szCs w:val="21"/>
-        </w:rPr>
-        <w:t>JECT</w:t>
-      </w:r>
-      <w:r>
-        <w:rPr>
-          <w:rFonts w:ascii="Times New Roman" w:hAnsi="Times New Roman" w:cs="Times New Roman"/>
-          <w:sz w:val="21"/>
-          <w:szCs w:val="21"/>
-        </w:rPr>
-        <w:t xml:space="preserve"> EXPERIENCE</w:t>
-      </w:r>
-    </w:p>
-    <w:bookmarkEnd w:id="7"/>
-    <w:bookmarkEnd w:id="8"/>
+        <w:rPr>
+          <w:rFonts w:ascii="Times New Roman" w:hAnsi="Times New Roman" w:cs="Times New Roman"/>
+          <w:sz w:val="21"/>
+          <w:szCs w:val="21"/>
+        </w:rPr>
+      </w:pPr>
+      <w:r>
+        <w:rPr>
+          <w:rFonts w:ascii="Times New Roman" w:hAnsi="Times New Roman" w:cs="Times New Roman"/>
+          <w:sz w:val="21"/>
+          <w:szCs w:val="21"/>
+        </w:rPr>
+        <w:t xml:space="preserve">PUBLICATIONS</w:t>
+      </w:r>
+    </w:p>
+    <w:p>
+      <w:pPr>
+        <w:tabs>
+          <w:tab w:val="right" w:pos="10790"/>
+        </w:tabs>
+        <w:adjustRightInd w:val="0"/>
+        <w:rPr>
+          <w:sz w:val="21"/>
+          <w:szCs w:val="21"/>
+        </w:rPr>
+      </w:pPr>
+      <w:r>
+        <w:rPr>
+          <w:sz w:val="21"/>
+          <w:szCs w:val="21"/>
+        </w:rPr>
+        <w:t xml:space="preserve">Wenye Xue, </w:t>
+      </w:r>
+      <w:r>
+        <w:rPr>
+          <w:b/>
+          <w:bCs/>
+          <w:sz w:val="21"/>
+          <w:szCs w:val="21"/>
+        </w:rPr>
+        <w:t xml:space="preserve">Joseph Nissen</w:t>
+      </w:r>
+      <w:r>
+        <w:rPr>
+          <w:sz w:val="21"/>
+          <w:szCs w:val="21"/>
+        </w:rPr>
+        <w:t xml:space="preserve">, Yiming Zeng. </w:t>
+      </w:r>
+      <w:r>
+        <w:rPr>
+          <w:i/>
+          <w:iCs/>
+          <w:sz w:val="21"/>
+          <w:szCs w:val="21"/>
+        </w:rPr>
+        <w:t xml:space="preserve">Verified Connection Establishment for End-to-End Entanglement in Quantum Networks</w:t>
+      </w:r>
+      <w:r>
+        <w:rPr>
+          <w:sz w:val="21"/>
+          <w:szCs w:val="21"/>
+        </w:rPr>
+        <w:t xml:space="preserve">. Under submission, IEEE INFOCOM 2027.</w:t>
+      </w:r>
+    </w:p>
+    <w:p>
+      <w:pPr>
+        <w:pStyle w:val="JobTitle"/>
+        <w:numPr>
+          <w:ilvl w:val="0"/>
+          <w:numId w:val="3"/>
+        </w:numPr>
+        <w:tabs>
+          <w:tab w:val="clear" w:pos="7560"/>
+        </w:tabs>
+        <w:rPr>
+          <w:rFonts w:ascii="Times New Roman" w:hAnsi="Times New Roman" w:cs="Times New Roman"/>
+          <w:b w:val="0"/>
+          <w:bCs/>
+          <w:sz w:val="21"/>
+          <w:szCs w:val="21"/>
+        </w:rPr>
+      </w:pPr>
+      <w:r>
+        <w:rPr>
+          <w:rFonts w:ascii="Times New Roman" w:hAnsi="Times New Roman" w:cs="Times New Roman"/>
+          <w:b w:val="0"/>
+          <w:bCs/>
+          <w:sz w:val="21"/>
+          <w:szCs w:val="21"/>
+        </w:rPr>
+        <w:t xml:space="preserve">Built and debugged the NetSquid/SquidASM simulations benchmarking Verified Connection Establishment (ours) against VBQT and other baselines</w:t>
+      </w:r>
+    </w:p>
+    <w:p>
+      <w:pPr>
+        <w:pStyle w:val="JobTitle"/>
+        <w:numPr>
+          <w:ilvl w:val="0"/>
+          <w:numId w:val="3"/>
+        </w:numPr>
+        <w:tabs>
+          <w:tab w:val="clear" w:pos="7560"/>
+        </w:tabs>
+        <w:rPr>
+          <w:rFonts w:ascii="Times New Roman" w:hAnsi="Times New Roman" w:cs="Times New Roman"/>
+          <w:b w:val="0"/>
+          <w:bCs/>
+          <w:sz w:val="21"/>
+          <w:szCs w:val="21"/>
+        </w:rPr>
+      </w:pPr>
+      <w:r>
+        <w:rPr>
+          <w:rFonts w:ascii="Times New Roman" w:hAnsi="Times New Roman" w:cs="Times New Roman"/>
+          <w:b w:val="0"/>
+          <w:bCs/>
+          <w:sz w:val="21"/>
+          <w:szCs w:val="21"/>
+        </w:rPr>
+        <w:t xml:space="preserve">Prepared the paper’s figures and contributed to writing, revision, and consistency review across drafts</w:t>
+      </w:r>
+    </w:p>
+    <w:p>
+      <w:pPr>
+        <w:pStyle w:val="JobTitle"/>
+        <w:pBdr>
+          <w:bottom w:val="single" w:sz="8" w:space="1" w:color="7F7F7F"/>
+        </w:pBdr>
+        <w:spacing w:before="60" w:after="60"/>
+        <w:ind w:left="0"/>
+        <w:rPr>
+          <w:rFonts w:ascii="Times New Roman" w:hAnsi="Times New Roman" w:cs="Times New Roman"/>
+          <w:sz w:val="21"/>
+          <w:szCs w:val="21"/>
+        </w:rPr>
+      </w:pPr>
+      <w:r>
+        <w:rPr>
+          <w:rFonts w:ascii="Times New Roman" w:hAnsi="Times New Roman" w:cs="Times New Roman"/>
+          <w:sz w:val="21"/>
+          <w:szCs w:val="21"/>
+        </w:rPr>
+        <w:t xml:space="preserve">PROJECT EXPERIENCE</w:t>
+      </w:r>
+    </w:p>
     <w:p>
       <w:pPr>
         <w:pStyle w:val="JobTitle"/>
         <w:tabs>
           <w:tab w:val="clear" w:pos="7560"/>
+          <w:tab w:val="right" w:pos="10790"/>
         </w:tabs>
         <w:ind w:left="0"/>
-        <w:jc w:val="both"/>
-        <w:rPr>
-          <w:rFonts w:ascii="Times New Roman" w:hAnsi="Times New Roman" w:cs="Times New Roman"/>
-          <w:sz w:val="21"/>
-          <w:szCs w:val="21"/>
-        </w:rPr>
-      </w:pPr>
-      <w:r>
-        <w:rPr>
-          <w:rFonts w:ascii="Times New Roman" w:hAnsi="Times New Roman" w:cs="Times New Roman"/>
-          <w:sz w:val="21"/>
-          <w:szCs w:val="21"/>
-        </w:rPr>
-        <w:t xml:space="preserve">Machine Learning Capstone                                                                                                                                              </w:t>
-      </w:r>
-      <w:r>
-        <w:rPr>
-          <w:rFonts w:ascii="Times New Roman" w:hAnsi="Times New Roman" w:cs="Times New Roman"/>
-          <w:sz w:val="21"/>
-          <w:szCs w:val="21"/>
-        </w:rPr>
-        <w:t xml:space="preserve">   </w:t>
-      </w:r>
-      <w:r>
-        <w:rPr>
-          <w:rFonts w:ascii="Times New Roman" w:hAnsi="Times New Roman" w:cs="Times New Roman"/>
-          <w:sz w:val="21"/>
-          <w:szCs w:val="21"/>
-        </w:rPr>
-        <w:t xml:space="preserve">      </w:t>
+        <w:rPr>
+          <w:rFonts w:ascii="Times New Roman" w:hAnsi="Times New Roman" w:cs="Times New Roman"/>
+          <w:sz w:val="21"/>
+          <w:szCs w:val="21"/>
+        </w:rPr>
+      </w:pPr>
+      <w:r>
+        <w:rPr>
+          <w:rFonts w:ascii="Times New Roman" w:hAnsi="Times New Roman" w:cs="Times New Roman"/>
+          <w:sz w:val="21"/>
+          <w:szCs w:val="21"/>
+        </w:rPr>
+        <w:t xml:space="preserve">Machine Learning Capstone</w:t>
       </w:r>
       <w:r>
         <w:rPr>
@@ -1145,6 +906,7 @@
           <w:sz w:val="21"/>
           <w:szCs w:val="21"/>
         </w:rPr>
+        <w:tab/>
         <w:t>2025</w:t>
       </w:r>
     </w:p>
@@ -1158,112 +920,23 @@
         <w:tabs>
           <w:tab w:val="clear" w:pos="7560"/>
         </w:tabs>
-        <w:jc w:val="both"/>
-        <w:rPr>
-          <w:rFonts w:ascii="Times New Roman" w:hAnsi="Times New Roman" w:cs="Times New Roman"/>
-          <w:sz w:val="21"/>
-          <w:szCs w:val="21"/>
-        </w:rPr>
-      </w:pPr>
-      <w:r>
-        <w:rPr>
-          <w:rFonts w:ascii="Times New Roman" w:hAnsi="Times New Roman" w:cs="Times New Roman"/>
-          <w:b w:val="0"/>
-          <w:bCs/>
-          <w:sz w:val="21"/>
-          <w:szCs w:val="21"/>
-        </w:rPr>
-        <w:t>Fine-tuned</w:t>
-      </w:r>
-      <w:r>
-        <w:rPr>
-          <w:rFonts w:ascii="Times New Roman" w:hAnsi="Times New Roman" w:cs="Times New Roman"/>
-          <w:b w:val="0"/>
-          <w:bCs/>
-          <w:sz w:val="21"/>
-          <w:szCs w:val="21"/>
-        </w:rPr>
-        <w:t xml:space="preserve"> </w:t>
-      </w:r>
-      <w:r>
-        <w:rPr>
-          <w:rFonts w:ascii="Times New Roman" w:hAnsi="Times New Roman" w:cs="Times New Roman"/>
-          <w:b w:val="0"/>
-          <w:bCs/>
-          <w:sz w:val="21"/>
-          <w:szCs w:val="21"/>
-        </w:rPr>
-        <w:t xml:space="preserve">multiple </w:t>
-      </w:r>
-      <w:r>
-        <w:rPr>
-          <w:rFonts w:ascii="Times New Roman" w:hAnsi="Times New Roman" w:cs="Times New Roman"/>
-          <w:b w:val="0"/>
-          <w:bCs/>
-          <w:sz w:val="21"/>
-          <w:szCs w:val="21"/>
-        </w:rPr>
-        <w:t>instruction</w:t>
-      </w:r>
-      <w:r>
-        <w:rPr>
-          <w:rFonts w:ascii="Times New Roman" w:hAnsi="Times New Roman" w:cs="Times New Roman"/>
-          <w:b w:val="0"/>
-          <w:bCs/>
-          <w:sz w:val="21"/>
-          <w:szCs w:val="21"/>
-        </w:rPr>
-        <w:t>-</w:t>
-      </w:r>
-      <w:r>
-        <w:rPr>
-          <w:rFonts w:ascii="Times New Roman" w:hAnsi="Times New Roman" w:cs="Times New Roman"/>
-          <w:b w:val="0"/>
-          <w:bCs/>
-          <w:sz w:val="21"/>
-          <w:szCs w:val="21"/>
-        </w:rPr>
-        <w:t xml:space="preserve">based large language models </w:t>
-      </w:r>
-      <w:r>
-        <w:rPr>
-          <w:rFonts w:ascii="Times New Roman" w:hAnsi="Times New Roman" w:cs="Times New Roman"/>
-          <w:b w:val="0"/>
-          <w:bCs/>
-          <w:sz w:val="21"/>
-          <w:szCs w:val="21"/>
-        </w:rPr>
-        <w:t xml:space="preserve">to </w:t>
-      </w:r>
-      <w:r>
-        <w:rPr>
-          <w:rFonts w:ascii="Times New Roman" w:hAnsi="Times New Roman" w:cs="Times New Roman"/>
-          <w:b w:val="0"/>
-          <w:bCs/>
-          <w:sz w:val="21"/>
-          <w:szCs w:val="21"/>
-        </w:rPr>
-        <w:t xml:space="preserve">teach </w:t>
-      </w:r>
-      <w:r>
-        <w:rPr>
-          <w:rFonts w:ascii="Times New Roman" w:hAnsi="Times New Roman" w:cs="Times New Roman"/>
-          <w:b w:val="0"/>
-          <w:bCs/>
-          <w:sz w:val="21"/>
-          <w:szCs w:val="21"/>
-        </w:rPr>
-        <w:t>programming</w:t>
-      </w:r>
-      <w:r>
-        <w:rPr>
-          <w:rFonts w:ascii="Times New Roman" w:hAnsi="Times New Roman" w:cs="Times New Roman"/>
-          <w:b w:val="0"/>
-          <w:bCs/>
-          <w:sz w:val="21"/>
-          <w:szCs w:val="21"/>
-        </w:rPr>
-        <w:t xml:space="preserve"> in Lua</w:t>
+        <w:rPr>
+          <w:rFonts w:ascii="Times New Roman" w:hAnsi="Times New Roman" w:cs="Times New Roman"/>
+          <w:b w:val="0"/>
+          <w:bCs/>
+          <w:sz w:val="21"/>
+          <w:szCs w:val="21"/>
+        </w:rPr>
+      </w:pPr>
+      <w:r>
+        <w:rPr>
+          <w:rFonts w:ascii="Times New Roman" w:hAnsi="Times New Roman" w:cs="Times New Roman"/>
+          <w:b w:val="0"/>
+          <w:bCs/>
+          <w:sz w:val="21"/>
+          <w:szCs w:val="21"/>
+        </w:rPr>
+        <w:t xml:space="preserve">Fine-tuned multiple instruction-based large language models to teach programming in Lua</w:t>
       </w:r>
     </w:p>
     <w:p>
@@ -1276,32 +949,23 @@
         <w:tabs>
           <w:tab w:val="clear" w:pos="7560"/>
         </w:tabs>
-        <w:jc w:val="both"/>
-        <w:rPr>
-          <w:rFonts w:ascii="Times New Roman" w:hAnsi="Times New Roman" w:cs="Times New Roman"/>
-          <w:sz w:val="21"/>
-          <w:szCs w:val="21"/>
-        </w:rPr>
-      </w:pPr>
-      <w:r>
-        <w:rPr>
-          <w:rFonts w:ascii="Times New Roman" w:hAnsi="Times New Roman" w:cs="Times New Roman"/>
-          <w:b w:val="0"/>
-          <w:bCs/>
-          <w:sz w:val="21"/>
-          <w:szCs w:val="21"/>
-        </w:rPr>
-        <w:t xml:space="preserve">Used model distillation techniques to create a </w:t>
-      </w:r>
-      <w:r>
-        <w:rPr>
-          <w:rFonts w:ascii="Times New Roman" w:hAnsi="Times New Roman" w:cs="Times New Roman"/>
-          <w:b w:val="0"/>
-          <w:bCs/>
-          <w:sz w:val="21"/>
-          <w:szCs w:val="21"/>
-        </w:rPr>
-        <w:t>synthetic dataset</w:t>
+        <w:rPr>
+          <w:rFonts w:ascii="Times New Roman" w:hAnsi="Times New Roman" w:cs="Times New Roman"/>
+          <w:b w:val="0"/>
+          <w:bCs/>
+          <w:sz w:val="21"/>
+          <w:szCs w:val="21"/>
+        </w:rPr>
+      </w:pPr>
+      <w:r>
+        <w:rPr>
+          <w:rFonts w:ascii="Times New Roman" w:hAnsi="Times New Roman" w:cs="Times New Roman"/>
+          <w:b w:val="0"/>
+          <w:bCs/>
+          <w:sz w:val="21"/>
+          <w:szCs w:val="21"/>
+        </w:rPr>
+        <w:t xml:space="preserve">Used model distillation techniques to create a synthetic dataset</w:t>
       </w:r>
     </w:p>
     <w:p>
@@ -1314,32 +978,23 @@
         <w:tabs>
           <w:tab w:val="clear" w:pos="7560"/>
         </w:tabs>
-        <w:jc w:val="both"/>
-        <w:rPr>
-          <w:rFonts w:ascii="Times New Roman" w:hAnsi="Times New Roman" w:cs="Times New Roman"/>
-          <w:sz w:val="21"/>
-          <w:szCs w:val="21"/>
-        </w:rPr>
-      </w:pPr>
-      <w:r>
-        <w:rPr>
-          <w:rFonts w:ascii="Times New Roman" w:hAnsi="Times New Roman" w:cs="Times New Roman"/>
-          <w:b w:val="0"/>
-          <w:bCs/>
-          <w:sz w:val="21"/>
-          <w:szCs w:val="21"/>
-        </w:rPr>
-        <w:t>Compared various models and training variables and explained my findings</w:t>
-      </w:r>
-      <w:r>
-        <w:rPr>
-          <w:rFonts w:ascii="Times New Roman" w:hAnsi="Times New Roman" w:cs="Times New Roman"/>
-          <w:b w:val="0"/>
-          <w:bCs/>
-          <w:sz w:val="21"/>
-          <w:szCs w:val="21"/>
-        </w:rPr>
-        <w:t xml:space="preserve"> in paper format</w:t>
+        <w:rPr>
+          <w:rFonts w:ascii="Times New Roman" w:hAnsi="Times New Roman" w:cs="Times New Roman"/>
+          <w:b w:val="0"/>
+          <w:bCs/>
+          <w:sz w:val="21"/>
+          <w:szCs w:val="21"/>
+        </w:rPr>
+      </w:pPr>
+      <w:r>
+        <w:rPr>
+          <w:rFonts w:ascii="Times New Roman" w:hAnsi="Times New Roman" w:cs="Times New Roman"/>
+          <w:b w:val="0"/>
+          <w:bCs/>
+          <w:sz w:val="21"/>
+          <w:szCs w:val="21"/>
+        </w:rPr>
+        <w:t xml:space="preserve">Compared various models and training variables and explained my findings in paper format</w:t>
       </w:r>
     </w:p>
     <w:p>
@@ -1347,48 +1002,22 @@
         <w:pStyle w:val="JobTitle"/>
         <w:tabs>
           <w:tab w:val="clear" w:pos="7560"/>
+          <w:tab w:val="right" w:pos="10790"/>
         </w:tabs>
         <w:ind w:left="0"/>
-        <w:jc w:val="both"/>
-        <w:rPr>
-          <w:rFonts w:ascii="Times New Roman" w:hAnsi="Times New Roman" w:cs="Times New Roman"/>
-          <w:sz w:val="21"/>
-          <w:szCs w:val="21"/>
-        </w:rPr>
-      </w:pPr>
-      <w:r>
-        <w:rPr>
-          <w:rFonts w:ascii="Times New Roman" w:hAnsi="Times New Roman" w:cs="Times New Roman"/>
-          <w:sz w:val="21"/>
-          <w:szCs w:val="21"/>
-        </w:rPr>
-        <w:t>Digital Board Game</w:t>
-      </w:r>
-      <w:r>
-        <w:rPr>
-          <w:rFonts w:ascii="Times New Roman" w:hAnsi="Times New Roman" w:cs="Times New Roman"/>
-          <w:sz w:val="21"/>
-          <w:szCs w:val="21"/>
-        </w:rPr>
-        <w:t xml:space="preserve"> – “</w:t>
-      </w:r>
-      <w:proofErr w:type="gramStart"/>
-      <w:r>
-        <w:rPr>
-          <w:rFonts w:ascii="Times New Roman" w:hAnsi="Times New Roman" w:cs="Times New Roman"/>
-          <w:sz w:val="21"/>
-          <w:szCs w:val="21"/>
-        </w:rPr>
-        <w:t xml:space="preserve">Carcassonne”   </w:t>
-      </w:r>
-      <w:proofErr w:type="gramEnd"/>
-      <w:r>
-        <w:rPr>
-          <w:rFonts w:ascii="Times New Roman" w:hAnsi="Times New Roman" w:cs="Times New Roman"/>
-          <w:sz w:val="21"/>
-          <w:szCs w:val="21"/>
-        </w:rPr>
-        <w:t xml:space="preserve">                                                                                                                                  </w:t>
+        <w:rPr>
+          <w:rFonts w:ascii="Times New Roman" w:hAnsi="Times New Roman" w:cs="Times New Roman"/>
+          <w:sz w:val="21"/>
+          <w:szCs w:val="21"/>
+        </w:rPr>
+      </w:pPr>
+      <w:r>
+        <w:rPr>
+          <w:rFonts w:ascii="Times New Roman" w:hAnsi="Times New Roman" w:cs="Times New Roman"/>
+          <w:sz w:val="21"/>
+          <w:szCs w:val="21"/>
+        </w:rPr>
+        <w:t xml:space="preserve">Synthetic Tabular Data Generation</w:t>
       </w:r>
       <w:r>
         <w:rPr>
@@ -1400,7 +1029,8 @@
           <w:sz w:val="21"/>
           <w:szCs w:val="21"/>
         </w:rPr>
-        <w:t>2023</w:t>
+        <w:tab/>
+        <w:t>2025</w:t>
       </w:r>
     </w:p>
     <w:p>
@@ -1413,21 +1043,23 @@
         <w:tabs>
           <w:tab w:val="clear" w:pos="7560"/>
         </w:tabs>
-        <w:jc w:val="both"/>
-        <w:rPr>
-          <w:rFonts w:ascii="Times New Roman" w:hAnsi="Times New Roman" w:cs="Times New Roman"/>
-          <w:sz w:val="21"/>
-          <w:szCs w:val="21"/>
-        </w:rPr>
-      </w:pPr>
-      <w:r>
-        <w:rPr>
-          <w:rFonts w:ascii="Times New Roman" w:hAnsi="Times New Roman" w:cs="Times New Roman"/>
-          <w:b w:val="0"/>
-          <w:sz w:val="21"/>
-          <w:szCs w:val="21"/>
-        </w:rPr>
-        <w:t>Collaborated with a 4-person team to design and implement a C++ desktop game environment simulating tile placement and rule logic</w:t>
+        <w:rPr>
+          <w:rFonts w:ascii="Times New Roman" w:hAnsi="Times New Roman" w:cs="Times New Roman"/>
+          <w:b w:val="0"/>
+          <w:bCs/>
+          <w:sz w:val="21"/>
+          <w:szCs w:val="21"/>
+        </w:rPr>
+      </w:pPr>
+      <w:r>
+        <w:rPr>
+          <w:rFonts w:ascii="Times New Roman" w:hAnsi="Times New Roman" w:cs="Times New Roman"/>
+          <w:b w:val="0"/>
+          <w:bCs/>
+          <w:sz w:val="21"/>
+          <w:szCs w:val="21"/>
+        </w:rPr>
+        <w:t xml:space="preserve">Generated synthetic records from the UCI Adult census dataset, comparing GAN-based and VAE-based synthesizers</w:t>
       </w:r>
     </w:p>
     <w:p>
@@ -1440,32 +1072,23 @@
         <w:tabs>
           <w:tab w:val="clear" w:pos="7560"/>
         </w:tabs>
-        <w:jc w:val="both"/>
-        <w:rPr>
-          <w:rFonts w:ascii="Times New Roman" w:hAnsi="Times New Roman" w:cs="Times New Roman"/>
-          <w:sz w:val="21"/>
-          <w:szCs w:val="21"/>
-        </w:rPr>
-      </w:pPr>
-      <w:r>
-        <w:rPr>
-          <w:rFonts w:ascii="Times New Roman" w:hAnsi="Times New Roman" w:cs="Times New Roman"/>
-          <w:b w:val="0"/>
-          <w:bCs/>
-          <w:sz w:val="21"/>
-          <w:szCs w:val="21"/>
-        </w:rPr>
-        <w:t>Developed modular C++ components using SFML libraries; handled game-state management, debugging, user interface design</w:t>
-      </w:r>
-      <w:r>
-        <w:rPr>
-          <w:rFonts w:ascii="Times New Roman" w:hAnsi="Times New Roman" w:cs="Times New Roman"/>
-          <w:b w:val="0"/>
-          <w:bCs/>
-          <w:sz w:val="21"/>
-          <w:szCs w:val="21"/>
-        </w:rPr>
-        <w:t>, documentation and presentation</w:t>
+        <w:rPr>
+          <w:rFonts w:ascii="Times New Roman" w:hAnsi="Times New Roman" w:cs="Times New Roman"/>
+          <w:b w:val="0"/>
+          <w:bCs/>
+          <w:sz w:val="21"/>
+          <w:szCs w:val="21"/>
+        </w:rPr>
+      </w:pPr>
+      <w:r>
+        <w:rPr>
+          <w:rFonts w:ascii="Times New Roman" w:hAnsi="Times New Roman" w:cs="Times New Roman"/>
+          <w:b w:val="0"/>
+          <w:bCs/>
+          <w:sz w:val="21"/>
+          <w:szCs w:val="21"/>
+        </w:rPr>
+        <w:t xml:space="preserve">Trained classifiers on real and synthetic data and scored both against a held-out real test set to measure utility</w:t>
       </w:r>
     </w:p>
     <w:p>
@@ -1478,40 +1101,24 @@
         <w:tabs>
           <w:tab w:val="clear" w:pos="7560"/>
         </w:tabs>
-        <w:jc w:val="both"/>
-        <w:rPr>
-          <w:rFonts w:ascii="Times New Roman" w:hAnsi="Times New Roman" w:cs="Times New Roman"/>
-          <w:sz w:val="21"/>
-          <w:szCs w:val="21"/>
-        </w:rPr>
-      </w:pPr>
-      <w:r>
-        <w:rPr>
-          <w:rFonts w:ascii="Times New Roman" w:hAnsi="Times New Roman" w:cs="Times New Roman"/>
-          <w:b w:val="0"/>
-          <w:sz w:val="21"/>
-          <w:szCs w:val="21"/>
-        </w:rPr>
-        <w:t>Utilized Git for source control and participated in iterative testing cycles, simulating a professional software development workflow</w:t>
-      </w:r>
-    </w:p>
-    <w:bookmarkEnd w:id="1"/>
-    <w:bookmarkEnd w:id="2"/>
-    <w:bookmarkEnd w:id="5"/>
-    <w:p>
-      <w:pPr>
-        <w:pStyle w:val="JobTitle"/>
-        <w:tabs>
-          <w:tab w:val="clear" w:pos="7560"/>
-        </w:tabs>
-        <w:spacing w:after="80"/>
-        <w:ind w:left="0"/>
-        <w:rPr>
-          <w:rFonts w:ascii="Times New Roman" w:hAnsi="Times New Roman" w:cs="Times New Roman"/>
-          <w:sz w:val="21"/>
-          <w:szCs w:val="21"/>
-        </w:rPr>
-      </w:pPr>
+        <w:rPr>
+          <w:rFonts w:ascii="Times New Roman" w:hAnsi="Times New Roman" w:cs="Times New Roman"/>
+          <w:b w:val="0"/>
+          <w:bCs/>
+          <w:sz w:val="21"/>
+          <w:szCs w:val="21"/>
+        </w:rPr>
+      </w:pPr>
+      <w:r>
+        <w:rPr>
+          <w:rFonts w:ascii="Times New Roman" w:hAnsi="Times New Roman" w:cs="Times New Roman"/>
+          <w:b w:val="0"/>
+          <w:bCs/>
+          <w:sz w:val="21"/>
+          <w:szCs w:val="21"/>
+        </w:rPr>
+        <w:t xml:space="preserve">Built the preprocessing pipeline handling mixed categorical and continuous features and one-hot column alignment</w:t>
+      </w:r>
     </w:p>
     <w:p>
       <w:pPr>
@@ -1519,30 +1126,128 @@
         <w:pBdr>
           <w:bottom w:val="single" w:sz="8" w:space="1" w:color="7F7F7F"/>
         </w:pBdr>
-        <w:spacing w:after="80"/>
+        <w:spacing w:before="60" w:after="60"/>
         <w:ind w:left="0"/>
-        <w:jc w:val="both"/>
-        <w:rPr>
-          <w:rFonts w:ascii="Times New Roman" w:hAnsi="Times New Roman" w:cs="Times New Roman"/>
-          <w:sz w:val="21"/>
-          <w:szCs w:val="21"/>
-        </w:rPr>
-      </w:pPr>
-      <w:r>
-        <w:rPr>
-          <w:rFonts w:ascii="Times New Roman" w:hAnsi="Times New Roman" w:cs="Times New Roman"/>
-          <w:sz w:val="21"/>
-          <w:szCs w:val="21"/>
-        </w:rPr>
-        <w:t>AWARDS</w:t>
-      </w:r>
-      <w:r>
-        <w:rPr>
-          <w:rFonts w:ascii="Times New Roman" w:hAnsi="Times New Roman" w:cs="Times New Roman"/>
-          <w:sz w:val="21"/>
-          <w:szCs w:val="21"/>
-        </w:rPr>
-        <w:t xml:space="preserve"> &amp; HONORS</w:t>
+        <w:rPr>
+          <w:rFonts w:ascii="Times New Roman" w:hAnsi="Times New Roman" w:cs="Times New Roman"/>
+          <w:sz w:val="21"/>
+          <w:szCs w:val="21"/>
+        </w:rPr>
+      </w:pPr>
+      <w:r>
+        <w:rPr>
+          <w:rFonts w:ascii="Times New Roman" w:hAnsi="Times New Roman" w:cs="Times New Roman"/>
+          <w:sz w:val="21"/>
+          <w:szCs w:val="21"/>
+        </w:rPr>
+        <w:t xml:space="preserve">RELEVANT SKILLS</w:t>
+      </w:r>
+    </w:p>
+    <w:p>
+      <w:pPr>
+        <w:tabs>
+          <w:tab w:val="right" w:pos="10790"/>
+        </w:tabs>
+        <w:adjustRightInd w:val="0"/>
+        <w:rPr>
+          <w:sz w:val="21"/>
+          <w:szCs w:val="21"/>
+        </w:rPr>
+      </w:pPr>
+      <w:r>
+        <w:rPr>
+          <w:b/>
+          <w:bCs/>
+          <w:sz w:val="21"/>
+          <w:szCs w:val="21"/>
+        </w:rPr>
+        <w:t xml:space="preserve">Languages: </w:t>
+      </w:r>
+      <w:r>
+        <w:rPr>
+          <w:sz w:val="21"/>
+          <w:szCs w:val="21"/>
+        </w:rPr>
+        <w:t xml:space="preserve">Python, C, C++, Java, JavaScript, SQL</w:t>
+      </w:r>
+    </w:p>
+    <w:p>
+      <w:pPr>
+        <w:tabs>
+          <w:tab w:val="right" w:pos="10790"/>
+        </w:tabs>
+        <w:adjustRightInd w:val="0"/>
+        <w:rPr>
+          <w:sz w:val="21"/>
+          <w:szCs w:val="21"/>
+        </w:rPr>
+      </w:pPr>
+      <w:r>
+        <w:rPr>
+          <w:b/>
+          <w:bCs/>
+          <w:sz w:val="21"/>
+          <w:szCs w:val="21"/>
+        </w:rPr>
+        <w:t xml:space="preserve">Software: </w:t>
+      </w:r>
+      <w:r>
+        <w:rPr>
+          <w:sz w:val="21"/>
+          <w:szCs w:val="21"/>
+        </w:rPr>
+        <w:t xml:space="preserve">Git, Visual Studio Code, Claude Code, Linux/WSL2, Jupyter Notebooks, Google Colab, Tableau, NetSquid</w:t>
+      </w:r>
+    </w:p>
+    <w:p>
+      <w:pPr>
+        <w:tabs>
+          <w:tab w:val="right" w:pos="10790"/>
+        </w:tabs>
+        <w:adjustRightInd w:val="0"/>
+        <w:rPr>
+          <w:sz w:val="21"/>
+          <w:szCs w:val="21"/>
+        </w:rPr>
+      </w:pPr>
+      <w:r>
+        <w:rPr>
+          <w:b/>
+          <w:bCs/>
+          <w:sz w:val="21"/>
+          <w:szCs w:val="21"/>
+        </w:rPr>
+        <w:t xml:space="preserve">Data &amp; ML: </w:t>
+      </w:r>
+      <w:r>
+        <w:rPr>
+          <w:sz w:val="21"/>
+          <w:szCs w:val="21"/>
+        </w:rPr>
+        <w:t xml:space="preserve">pandas, PostgreSQL, MongoDB/Mongoose, Data Preprocessing, Data Visualization, Predictive Modeling</w:t>
+      </w:r>
+    </w:p>
+    <w:p>
+      <w:pPr>
+        <w:pStyle w:val="JobTitle"/>
+        <w:pBdr>
+          <w:bottom w:val="single" w:sz="8" w:space="1" w:color="7F7F7F"/>
+        </w:pBdr>
+        <w:spacing w:before="60" w:after="60"/>
+        <w:ind w:left="0"/>
+        <w:rPr>
+          <w:rFonts w:ascii="Times New Roman" w:hAnsi="Times New Roman" w:cs="Times New Roman"/>
+          <w:sz w:val="21"/>
+          <w:szCs w:val="21"/>
+        </w:rPr>
+      </w:pPr>
+      <w:r>
+        <w:rPr>
+          <w:rFonts w:ascii="Times New Roman" w:hAnsi="Times New Roman" w:cs="Times New Roman"/>
+          <w:sz w:val="21"/>
+          <w:szCs w:val="21"/>
+        </w:rPr>
+        <w:t xml:space="preserve">AWARDS &amp; HONORS</w:t>
       </w:r>
     </w:p>
     <w:p>
@@ -1552,34 +1257,27 @@
           <w:ilvl w:val="0"/>
           <w:numId w:val="10"/>
         </w:numPr>
-        <w:rPr>
-          <w:sz w:val="21"/>
-          <w:szCs w:val="21"/>
-        </w:rPr>
-      </w:pPr>
-      <w:r>
-        <w:rPr>
-          <w:sz w:val="21"/>
-          <w:szCs w:val="21"/>
-        </w:rPr>
-        <w:t>First Place, UtiCode Coding Competition</w:t>
-      </w:r>
-      <w:r>
-        <w:rPr>
-          <w:sz w:val="21"/>
-          <w:szCs w:val="21"/>
-        </w:rPr>
-        <w:t xml:space="preserve">                                                                                                                                 </w:t>
-      </w:r>
-      <w:r>
-        <w:rPr>
-          <w:sz w:val="21"/>
-          <w:szCs w:val="21"/>
-        </w:rPr>
-        <w:t xml:space="preserve"> </w:t>
-      </w:r>
-      <w:r>
-        <w:rPr>
+        <w:tabs>
+          <w:tab w:val="clear" w:pos="7560"/>
+          <w:tab w:val="right" w:pos="10790"/>
+        </w:tabs>
+        <w:rPr>
+          <w:rFonts w:ascii="Times New Roman" w:hAnsi="Times New Roman" w:cs="Times New Roman"/>
+          <w:sz w:val="21"/>
+          <w:szCs w:val="21"/>
+        </w:rPr>
+      </w:pPr>
+      <w:r>
+        <w:rPr>
+          <w:rFonts w:ascii="Times New Roman" w:hAnsi="Times New Roman" w:cs="Times New Roman"/>
+          <w:sz w:val="21"/>
+          <w:szCs w:val="21"/>
+        </w:rPr>
+        <w:t xml:space="preserve">First Place, UtiCode Coding Competition</w:t>
+      </w:r>
+      <w:r>
+        <w:rPr>
+          <w:rFonts w:ascii="Times New Roman" w:hAnsi="Times New Roman" w:cs="Times New Roman"/>
           <w:b w:val="0"/>
           <w:bCs/>
           <w:i/>
@@ -1587,6 +1285,7 @@
           <w:sz w:val="21"/>
           <w:szCs w:val="21"/>
         </w:rPr>
+        <w:tab/>
         <w:t>2025</w:t>
       </w:r>
     </w:p>
@@ -1597,34 +1296,27 @@
           <w:ilvl w:val="0"/>
           <w:numId w:val="10"/>
         </w:numPr>
-        <w:rPr>
-          <w:sz w:val="21"/>
-          <w:szCs w:val="21"/>
-        </w:rPr>
-      </w:pPr>
-      <w:r>
-        <w:rPr>
-          <w:sz w:val="21"/>
-          <w:szCs w:val="21"/>
-        </w:rPr>
-        <w:t xml:space="preserve">Second Place, SUNY Polytechnic Institute Coding Competition                                                 </w:t>
-      </w:r>
-      <w:r>
-        <w:rPr>
-          <w:sz w:val="21"/>
-          <w:szCs w:val="21"/>
-        </w:rPr>
-        <w:t xml:space="preserve">                </w:t>
-      </w:r>
-      <w:r>
-        <w:rPr>
-          <w:sz w:val="21"/>
-          <w:szCs w:val="21"/>
-        </w:rPr>
-        <w:t xml:space="preserve">                          </w:t>
-      </w:r>
-      <w:r>
-        <w:rPr>
+        <w:tabs>
+          <w:tab w:val="clear" w:pos="7560"/>
+          <w:tab w:val="right" w:pos="10790"/>
+        </w:tabs>
+        <w:rPr>
+          <w:rFonts w:ascii="Times New Roman" w:hAnsi="Times New Roman" w:cs="Times New Roman"/>
+          <w:sz w:val="21"/>
+          <w:szCs w:val="21"/>
+        </w:rPr>
+      </w:pPr>
+      <w:r>
+        <w:rPr>
+          <w:rFonts w:ascii="Times New Roman" w:hAnsi="Times New Roman" w:cs="Times New Roman"/>
+          <w:sz w:val="21"/>
+          <w:szCs w:val="21"/>
+        </w:rPr>
+        <w:t xml:space="preserve">Second Place, SUNY Polytechnic Institute Coding Competition</w:t>
+      </w:r>
+      <w:r>
+        <w:rPr>
+          <w:rFonts w:ascii="Times New Roman" w:hAnsi="Times New Roman" w:cs="Times New Roman"/>
           <w:b w:val="0"/>
           <w:bCs/>
           <w:i/>
@@ -1632,6 +1324,7 @@
           <w:sz w:val="21"/>
           <w:szCs w:val="21"/>
         </w:rPr>
+        <w:tab/>
         <w:t>2024</w:t>
       </w:r>
     </w:p>
@@ -1642,34 +1335,27 @@
           <w:ilvl w:val="0"/>
           <w:numId w:val="10"/>
         </w:numPr>
-        <w:rPr>
-          <w:sz w:val="21"/>
-          <w:szCs w:val="21"/>
-        </w:rPr>
-      </w:pPr>
-      <w:r>
-        <w:rPr>
-          <w:sz w:val="21"/>
-          <w:szCs w:val="21"/>
-        </w:rPr>
-        <w:t xml:space="preserve">Dean’s List at SUNY Polytechnic Institute                                                                       </w:t>
-      </w:r>
-      <w:r>
-        <w:rPr>
-          <w:sz w:val="21"/>
-          <w:szCs w:val="21"/>
-        </w:rPr>
-        <w:t xml:space="preserve">                 </w:t>
-      </w:r>
-      <w:r>
-        <w:rPr>
-          <w:sz w:val="21"/>
-          <w:szCs w:val="21"/>
-        </w:rPr>
-        <w:t xml:space="preserve">        </w:t>
-      </w:r>
-      <w:r>
-        <w:rPr>
+        <w:tabs>
+          <w:tab w:val="clear" w:pos="7560"/>
+          <w:tab w:val="right" w:pos="10790"/>
+        </w:tabs>
+        <w:rPr>
+          <w:rFonts w:ascii="Times New Roman" w:hAnsi="Times New Roman" w:cs="Times New Roman"/>
+          <w:sz w:val="21"/>
+          <w:szCs w:val="21"/>
+        </w:rPr>
+      </w:pPr>
+      <w:r>
+        <w:rPr>
+          <w:rFonts w:ascii="Times New Roman" w:hAnsi="Times New Roman" w:cs="Times New Roman"/>
+          <w:sz w:val="21"/>
+          <w:szCs w:val="21"/>
+        </w:rPr>
+        <w:t xml:space="preserve">Dean’s List at SUNY Polytechnic Institute</w:t>
+      </w:r>
+      <w:r>
+        <w:rPr>
+          <w:rFonts w:ascii="Times New Roman" w:hAnsi="Times New Roman" w:cs="Times New Roman"/>
           <w:b w:val="0"/>
           <w:bCs/>
           <w:i/>
@@ -1677,14 +1363,8 @@
           <w:sz w:val="21"/>
           <w:szCs w:val="21"/>
         </w:rPr>
-        <w:t>Fall 2021 – Spring 2025</w:t>
-      </w:r>
-      <w:r>
-        <w:rPr>
-          <w:sz w:val="21"/>
-          <w:szCs w:val="21"/>
-        </w:rPr>
-        <w:t xml:space="preserve">                                       </w:t>
+        <w:tab/>
+        <w:t>Fall 2021 - Spring 2025</w:t>
       </w:r>
     </w:p>
     <w:sectPr>

</xml_diff>